<commit_message>
ciberescudo: entregables con la ampliación de Convivencia
Documentación técnica, guion, pitch (148 palabras) y bitácora (entrada 13)
actualizados con bullying, ciberacoso y convivencia escolar.

Co-Authored-By: Claude Opus 5.5 <noreply@anthropic.com>
Claude-Session: https://claude.ai/code/session_017mGPQDWJF6quXgxpQqh3gs
</commit_message>
<xml_diff>
--- a/ciberescudo/entregables/BITACORA_IA.docx
+++ b/ciberescudo/entregables/BITACORA_IA.docx
@@ -9537,6 +9537,625 @@
                 <w:szCs w:val="22"/>
               </w:rPr>
               <w:t xml:space="preserve">13</w:t>
+            </w:r>
+          </w:p>
+        </w:tc>
+      </w:tr>
+      <w:tr>
+        <w:trPr>
+          <w:cantSplit w:val="off"/>
+        </w:trPr>
+        <w:tc>
+          <w:tcPr>
+            <w:tcW w:type="dxa" w:w="2600"/>
+            <w:tcBorders>
+              <w:top w:val="single" w:color="BBBBBB" w:sz="4"/>
+              <w:left w:val="single" w:color="BBBBBB" w:sz="4"/>
+              <w:bottom w:val="single" w:color="BBBBBB" w:sz="4"/>
+              <w:right w:val="single" w:color="BBBBBB" w:sz="4"/>
+            </w:tcBorders>
+            <w:shd w:fill="F3EEFA" w:color="auto" w:val="clear"/>
+            <w:tcMar>
+              <w:top w:type="dxa" w:w="100"/>
+              <w:left w:type="dxa" w:w="140"/>
+              <w:bottom w:type="dxa" w:w="100"/>
+              <w:right w:type="dxa" w:w="140"/>
+            </w:tcMar>
+          </w:tcPr>
+          <w:p>
+            <w:pPr>
+              <w:spacing w:after="120" w:line="300"/>
+            </w:pPr>
+            <w:r>
+              <w:rPr>
+                <w:b/>
+                <w:bCs/>
+                <w:color w:val="222222"/>
+              </w:rPr>
+              <w:t xml:space="preserve">Fecha</w:t>
+            </w:r>
+          </w:p>
+        </w:tc>
+        <w:tc>
+          <w:tcPr>
+            <w:tcW w:type="dxa" w:w="6760"/>
+            <w:tcBorders>
+              <w:top w:val="single" w:color="BBBBBB" w:sz="4"/>
+              <w:left w:val="single" w:color="BBBBBB" w:sz="4"/>
+              <w:bottom w:val="single" w:color="BBBBBB" w:sz="4"/>
+              <w:right w:val="single" w:color="BBBBBB" w:sz="4"/>
+            </w:tcBorders>
+            <w:tcMar>
+              <w:top w:type="dxa" w:w="100"/>
+              <w:left w:type="dxa" w:w="140"/>
+              <w:bottom w:type="dxa" w:w="100"/>
+              <w:right w:type="dxa" w:w="140"/>
+            </w:tcMar>
+          </w:tcPr>
+          <w:p>
+            <w:pPr>
+              <w:spacing w:after="120" w:line="300"/>
+            </w:pPr>
+            <w:r>
+              <w:rPr>
+                <w:rFonts w:ascii="Arial" w:cs="Arial" w:eastAsia="Arial" w:hAnsi="Arial"/>
+                <w:color w:val="222222"/>
+                <w:sz w:val="22"/>
+                <w:szCs w:val="22"/>
+              </w:rPr>
+              <w:t xml:space="preserve">30 de octubre de 2026</w:t>
+            </w:r>
+          </w:p>
+        </w:tc>
+      </w:tr>
+      <w:tr>
+        <w:trPr>
+          <w:cantSplit w:val="off"/>
+        </w:trPr>
+        <w:tc>
+          <w:tcPr>
+            <w:tcW w:type="dxa" w:w="2600"/>
+            <w:tcBorders>
+              <w:top w:val="single" w:color="BBBBBB" w:sz="4"/>
+              <w:left w:val="single" w:color="BBBBBB" w:sz="4"/>
+              <w:bottom w:val="single" w:color="BBBBBB" w:sz="4"/>
+              <w:right w:val="single" w:color="BBBBBB" w:sz="4"/>
+            </w:tcBorders>
+            <w:shd w:fill="F3EEFA" w:color="auto" w:val="clear"/>
+            <w:tcMar>
+              <w:top w:type="dxa" w:w="100"/>
+              <w:left w:type="dxa" w:w="140"/>
+              <w:bottom w:type="dxa" w:w="100"/>
+              <w:right w:type="dxa" w:w="140"/>
+            </w:tcMar>
+          </w:tcPr>
+          <w:p>
+            <w:pPr>
+              <w:spacing w:after="120" w:line="300"/>
+            </w:pPr>
+            <w:r>
+              <w:rPr>
+                <w:b/>
+                <w:bCs/>
+                <w:color w:val="222222"/>
+              </w:rPr>
+              <w:t xml:space="preserve">Herramienta y modelo</w:t>
+            </w:r>
+          </w:p>
+        </w:tc>
+        <w:tc>
+          <w:tcPr>
+            <w:tcW w:type="dxa" w:w="6760"/>
+            <w:tcBorders>
+              <w:top w:val="single" w:color="BBBBBB" w:sz="4"/>
+              <w:left w:val="single" w:color="BBBBBB" w:sz="4"/>
+              <w:bottom w:val="single" w:color="BBBBBB" w:sz="4"/>
+              <w:right w:val="single" w:color="BBBBBB" w:sz="4"/>
+            </w:tcBorders>
+            <w:tcMar>
+              <w:top w:type="dxa" w:w="100"/>
+              <w:left w:type="dxa" w:w="140"/>
+              <w:bottom w:type="dxa" w:w="100"/>
+              <w:right w:type="dxa" w:w="140"/>
+            </w:tcMar>
+          </w:tcPr>
+          <w:p>
+            <w:pPr>
+              <w:spacing w:after="120" w:line="300"/>
+            </w:pPr>
+            <w:r>
+              <w:rPr>
+                <w:rFonts w:ascii="Arial" w:cs="Arial" w:eastAsia="Arial" w:hAnsi="Arial"/>
+                <w:color w:val="222222"/>
+                <w:sz w:val="22"/>
+                <w:szCs w:val="22"/>
+              </w:rPr>
+              <w:t xml:space="preserve">Claude (Anthropic) · modelo: Claude Opus 5.5 · plan: Claude Pro</w:t>
+            </w:r>
+          </w:p>
+        </w:tc>
+      </w:tr>
+      <w:tr>
+        <w:trPr>
+          <w:cantSplit w:val="off"/>
+        </w:trPr>
+        <w:tc>
+          <w:tcPr>
+            <w:tcW w:type="dxa" w:w="2600"/>
+            <w:tcBorders>
+              <w:top w:val="single" w:color="BBBBBB" w:sz="4"/>
+              <w:left w:val="single" w:color="BBBBBB" w:sz="4"/>
+              <w:bottom w:val="single" w:color="BBBBBB" w:sz="4"/>
+              <w:right w:val="single" w:color="BBBBBB" w:sz="4"/>
+            </w:tcBorders>
+            <w:shd w:fill="F3EEFA" w:color="auto" w:val="clear"/>
+            <w:tcMar>
+              <w:top w:type="dxa" w:w="100"/>
+              <w:left w:type="dxa" w:w="140"/>
+              <w:bottom w:type="dxa" w:w="100"/>
+              <w:right w:type="dxa" w:w="140"/>
+            </w:tcMar>
+          </w:tcPr>
+          <w:p>
+            <w:pPr>
+              <w:spacing w:after="120" w:line="300"/>
+            </w:pPr>
+            <w:r>
+              <w:rPr>
+                <w:b/>
+                <w:bCs/>
+                <w:color w:val="222222"/>
+              </w:rPr>
+              <w:t xml:space="preserve">Objetivo del prompt</w:t>
+            </w:r>
+          </w:p>
+        </w:tc>
+        <w:tc>
+          <w:tcPr>
+            <w:tcW w:type="dxa" w:w="6760"/>
+            <w:tcBorders>
+              <w:top w:val="single" w:color="BBBBBB" w:sz="4"/>
+              <w:left w:val="single" w:color="BBBBBB" w:sz="4"/>
+              <w:bottom w:val="single" w:color="BBBBBB" w:sz="4"/>
+              <w:right w:val="single" w:color="BBBBBB" w:sz="4"/>
+            </w:tcBorders>
+            <w:tcMar>
+              <w:top w:type="dxa" w:w="100"/>
+              <w:left w:type="dxa" w:w="140"/>
+              <w:bottom w:type="dxa" w:w="100"/>
+              <w:right w:type="dxa" w:w="140"/>
+            </w:tcMar>
+          </w:tcPr>
+          <w:p>
+            <w:pPr>
+              <w:spacing w:after="120" w:line="300"/>
+            </w:pPr>
+            <w:r>
+              <w:rPr>
+                <w:rFonts w:ascii="Arial" w:cs="Arial" w:eastAsia="Arial" w:hAnsi="Arial"/>
+                <w:color w:val="222222"/>
+                <w:sz w:val="22"/>
+                <w:szCs w:val="22"/>
+              </w:rPr>
+              <w:t xml:space="preserve">Ampliar CiberEscudo con prevención, detección y solución del bullying y el ciberacoso.</w:t>
+            </w:r>
+          </w:p>
+        </w:tc>
+      </w:tr>
+      <w:tr>
+        <w:trPr>
+          <w:cantSplit w:val="off"/>
+        </w:trPr>
+        <w:tc>
+          <w:tcPr>
+            <w:tcW w:type="dxa" w:w="2600"/>
+            <w:tcBorders>
+              <w:top w:val="single" w:color="BBBBBB" w:sz="4"/>
+              <w:left w:val="single" w:color="BBBBBB" w:sz="4"/>
+              <w:bottom w:val="single" w:color="BBBBBB" w:sz="4"/>
+              <w:right w:val="single" w:color="BBBBBB" w:sz="4"/>
+            </w:tcBorders>
+            <w:shd w:fill="F3EEFA" w:color="auto" w:val="clear"/>
+            <w:tcMar>
+              <w:top w:type="dxa" w:w="100"/>
+              <w:left w:type="dxa" w:w="140"/>
+              <w:bottom w:type="dxa" w:w="100"/>
+              <w:right w:type="dxa" w:w="140"/>
+            </w:tcMar>
+          </w:tcPr>
+          <w:p>
+            <w:pPr>
+              <w:spacing w:after="120" w:line="300"/>
+            </w:pPr>
+            <w:r>
+              <w:rPr>
+                <w:b/>
+                <w:bCs/>
+                <w:color w:val="222222"/>
+              </w:rPr>
+              <w:t xml:space="preserve">Prompt enviado</w:t>
+            </w:r>
+          </w:p>
+        </w:tc>
+        <w:tc>
+          <w:tcPr>
+            <w:tcW w:type="dxa" w:w="6760"/>
+            <w:tcBorders>
+              <w:top w:val="single" w:color="BBBBBB" w:sz="4"/>
+              <w:left w:val="single" w:color="BBBBBB" w:sz="4"/>
+              <w:bottom w:val="single" w:color="BBBBBB" w:sz="4"/>
+              <w:right w:val="single" w:color="BBBBBB" w:sz="4"/>
+            </w:tcBorders>
+            <w:tcMar>
+              <w:top w:type="dxa" w:w="100"/>
+              <w:left w:type="dxa" w:w="140"/>
+              <w:bottom w:type="dxa" w:w="100"/>
+              <w:right w:type="dxa" w:w="140"/>
+            </w:tcMar>
+          </w:tcPr>
+          <w:p>
+            <w:pPr>
+              <w:spacing w:after="120" w:line="300"/>
+            </w:pPr>
+            <w:r>
+              <w:rPr>
+                <w:rFonts w:ascii="Courier New" w:cs="Courier New" w:eastAsia="Courier New" w:hAnsi="Courier New"/>
+                <w:color w:val="222222"/>
+                <w:sz w:val="18"/>
+                <w:szCs w:val="18"/>
+              </w:rPr>
+              <w:t xml:space="preserve">Prompt maestro «Expansión de CiberEscudo — ciberseguridad, ciberacoso y convivencia escolar» (documento de 9 secciones: no destruir lo existente, Laboratorio de convivencia, simulador de decisiones, Identificar-Prevenir-Actuar, guía de incidentes, testigos, misiones). Después del plan de la IA respondimos: «1 no 2 Jalisco 3 si 4 18 5 para luego, también está bien hacer todo lo que dijiste, pero asegúrate que cubra tanto el identificar prevenir y actuar y esas cosas, como para lo digital y también para lo real».</w:t>
+            </w:r>
+          </w:p>
+        </w:tc>
+      </w:tr>
+      <w:tr>
+        <w:trPr>
+          <w:cantSplit w:val="off"/>
+        </w:trPr>
+        <w:tc>
+          <w:tcPr>
+            <w:tcW w:type="dxa" w:w="2600"/>
+            <w:tcBorders>
+              <w:top w:val="single" w:color="BBBBBB" w:sz="4"/>
+              <w:left w:val="single" w:color="BBBBBB" w:sz="4"/>
+              <w:bottom w:val="single" w:color="BBBBBB" w:sz="4"/>
+              <w:right w:val="single" w:color="BBBBBB" w:sz="4"/>
+            </w:tcBorders>
+            <w:shd w:fill="F3EEFA" w:color="auto" w:val="clear"/>
+            <w:tcMar>
+              <w:top w:type="dxa" w:w="100"/>
+              <w:left w:type="dxa" w:w="140"/>
+              <w:bottom w:type="dxa" w:w="100"/>
+              <w:right w:type="dxa" w:w="140"/>
+            </w:tcMar>
+          </w:tcPr>
+          <w:p>
+            <w:pPr>
+              <w:spacing w:after="120" w:line="300"/>
+            </w:pPr>
+            <w:r>
+              <w:rPr>
+                <w:b/>
+                <w:bCs/>
+                <w:color w:val="222222"/>
+              </w:rPr>
+              <w:t xml:space="preserve">Respuesta / código generado (resumen)</w:t>
+            </w:r>
+          </w:p>
+        </w:tc>
+        <w:tc>
+          <w:tcPr>
+            <w:tcW w:type="dxa" w:w="6760"/>
+            <w:tcBorders>
+              <w:top w:val="single" w:color="BBBBBB" w:sz="4"/>
+              <w:left w:val="single" w:color="BBBBBB" w:sz="4"/>
+              <w:bottom w:val="single" w:color="BBBBBB" w:sz="4"/>
+              <w:right w:val="single" w:color="BBBBBB" w:sz="4"/>
+            </w:tcBorders>
+            <w:tcMar>
+              <w:top w:type="dxa" w:w="100"/>
+              <w:left w:type="dxa" w:w="140"/>
+              <w:bottom w:type="dxa" w:w="100"/>
+              <w:right w:type="dxa" w:w="140"/>
+            </w:tcMar>
+          </w:tcPr>
+          <w:p>
+            <w:pPr>
+              <w:spacing w:after="120" w:line="300"/>
+            </w:pPr>
+            <w:r>
+              <w:rPr>
+                <w:rFonts w:ascii="Arial" w:cs="Arial" w:eastAsia="Arial" w:hAnsi="Arial"/>
+                <w:color w:val="222222"/>
+                <w:sz w:val="22"/>
+                <w:szCs w:val="22"/>
+              </w:rPr>
+              <w:t xml:space="preserve">Primero revisó el código real y propuso un plan por fases. Agregó la sección Laboratorio de convivencia (3 pasos en línea y en persona, 7 lecciones y testigo), 18 escenarios nuevos en 3 paquetes, 9 procedimientos de incidentes con 7 puntos cada uno, un mundo de 10 retos y 10 objetivos que se completan solos. Verificó en internet los teléfonos de ayuda (incluida la Policía Cibernética de Jalisco). Conservó los certificados ya ganados y subió las pruebas a 69.</w:t>
+            </w:r>
+          </w:p>
+        </w:tc>
+      </w:tr>
+      <w:tr>
+        <w:trPr>
+          <w:cantSplit w:val="off"/>
+        </w:trPr>
+        <w:tc>
+          <w:tcPr>
+            <w:tcW w:type="dxa" w:w="2600"/>
+            <w:tcBorders>
+              <w:top w:val="single" w:color="BBBBBB" w:sz="4"/>
+              <w:left w:val="single" w:color="BBBBBB" w:sz="4"/>
+              <w:bottom w:val="single" w:color="BBBBBB" w:sz="4"/>
+              <w:right w:val="single" w:color="BBBBBB" w:sz="4"/>
+            </w:tcBorders>
+            <w:shd w:fill="F3EEFA" w:color="auto" w:val="clear"/>
+            <w:tcMar>
+              <w:top w:type="dxa" w:w="100"/>
+              <w:left w:type="dxa" w:w="140"/>
+              <w:bottom w:type="dxa" w:w="100"/>
+              <w:right w:type="dxa" w:w="140"/>
+            </w:tcMar>
+          </w:tcPr>
+          <w:p>
+            <w:pPr>
+              <w:spacing w:after="120" w:line="300"/>
+            </w:pPr>
+            <w:r>
+              <w:rPr>
+                <w:b/>
+                <w:bCs/>
+                <w:color w:val="222222"/>
+              </w:rPr>
+              <w:t xml:space="preserve">Ajustes manuales del equipo</w:t>
+            </w:r>
+          </w:p>
+        </w:tc>
+        <w:tc>
+          <w:tcPr>
+            <w:tcW w:type="dxa" w:w="6760"/>
+            <w:tcBorders>
+              <w:top w:val="single" w:color="BBBBBB" w:sz="4"/>
+              <w:left w:val="single" w:color="BBBBBB" w:sz="4"/>
+              <w:bottom w:val="single" w:color="BBBBBB" w:sz="4"/>
+              <w:right w:val="single" w:color="BBBBBB" w:sz="4"/>
+            </w:tcBorders>
+            <w:tcMar>
+              <w:top w:type="dxa" w:w="100"/>
+              <w:left w:type="dxa" w:w="140"/>
+              <w:bottom w:type="dxa" w:w="100"/>
+              <w:right w:type="dxa" w:w="140"/>
+            </w:tcMar>
+          </w:tcPr>
+          <w:p>
+            <w:pPr>
+              <w:pBdr>
+                <w:bottom w:val="single" w:color="AAAAAA" w:sz="4" w:space="1"/>
+              </w:pBdr>
+              <w:spacing w:after="0" w:before="240"/>
+            </w:pPr>
+            <w:r>
+              <w:t xml:space="preserve"> </w:t>
+            </w:r>
+          </w:p>
+          <w:p>
+            <w:pPr>
+              <w:pBdr>
+                <w:bottom w:val="single" w:color="AAAAAA" w:sz="4" w:space="1"/>
+              </w:pBdr>
+              <w:spacing w:after="0" w:before="240"/>
+            </w:pPr>
+            <w:r>
+              <w:t xml:space="preserve"> </w:t>
+            </w:r>
+          </w:p>
+          <w:p>
+            <w:pPr>
+              <w:pBdr>
+                <w:bottom w:val="single" w:color="AAAAAA" w:sz="4" w:space="1"/>
+              </w:pBdr>
+              <w:spacing w:after="0" w:before="240"/>
+            </w:pPr>
+            <w:r>
+              <w:t xml:space="preserve"> </w:t>
+            </w:r>
+          </w:p>
+          <w:p>
+            <w:pPr>
+              <w:pBdr>
+                <w:bottom w:val="single" w:color="AAAAAA" w:sz="4" w:space="1"/>
+              </w:pBdr>
+              <w:spacing w:after="0" w:before="240"/>
+            </w:pPr>
+            <w:r>
+              <w:t xml:space="preserve"> </w:t>
+            </w:r>
+          </w:p>
+          <w:p>
+            <w:pPr>
+              <w:pBdr>
+                <w:bottom w:val="single" w:color="AAAAAA" w:sz="4" w:space="1"/>
+              </w:pBdr>
+              <w:spacing w:after="0" w:before="240"/>
+            </w:pPr>
+            <w:r>
+              <w:t xml:space="preserve"> </w:t>
+            </w:r>
+          </w:p>
+          <w:p>
+            <w:pPr>
+              <w:pBdr>
+                <w:bottom w:val="single" w:color="AAAAAA" w:sz="4" w:space="1"/>
+              </w:pBdr>
+              <w:spacing w:after="0" w:before="240"/>
+            </w:pPr>
+            <w:r>
+              <w:t xml:space="preserve"> </w:t>
+            </w:r>
+          </w:p>
+        </w:tc>
+      </w:tr>
+      <w:tr>
+        <w:trPr>
+          <w:cantSplit w:val="off"/>
+        </w:trPr>
+        <w:tc>
+          <w:tcPr>
+            <w:tcW w:type="dxa" w:w="2600"/>
+            <w:tcBorders>
+              <w:top w:val="single" w:color="BBBBBB" w:sz="4"/>
+              <w:left w:val="single" w:color="BBBBBB" w:sz="4"/>
+              <w:bottom w:val="single" w:color="BBBBBB" w:sz="4"/>
+              <w:right w:val="single" w:color="BBBBBB" w:sz="4"/>
+            </w:tcBorders>
+            <w:shd w:fill="F3EEFA" w:color="auto" w:val="clear"/>
+            <w:tcMar>
+              <w:top w:type="dxa" w:w="100"/>
+              <w:left w:type="dxa" w:w="140"/>
+              <w:bottom w:type="dxa" w:w="100"/>
+              <w:right w:type="dxa" w:w="140"/>
+            </w:tcMar>
+          </w:tcPr>
+          <w:p>
+            <w:pPr>
+              <w:spacing w:after="120" w:line="300"/>
+            </w:pPr>
+            <w:r>
+              <w:rPr>
+                <w:b/>
+                <w:bCs/>
+                <w:color w:val="222222"/>
+              </w:rPr>
+              <w:t xml:space="preserve">¿Cómo verificamos que funcionaba?</w:t>
+            </w:r>
+          </w:p>
+        </w:tc>
+        <w:tc>
+          <w:tcPr>
+            <w:tcW w:type="dxa" w:w="6760"/>
+            <w:tcBorders>
+              <w:top w:val="single" w:color="BBBBBB" w:sz="4"/>
+              <w:left w:val="single" w:color="BBBBBB" w:sz="4"/>
+              <w:bottom w:val="single" w:color="BBBBBB" w:sz="4"/>
+              <w:right w:val="single" w:color="BBBBBB" w:sz="4"/>
+            </w:tcBorders>
+            <w:tcMar>
+              <w:top w:type="dxa" w:w="100"/>
+              <w:left w:type="dxa" w:w="140"/>
+              <w:bottom w:type="dxa" w:w="100"/>
+              <w:right w:type="dxa" w:w="140"/>
+            </w:tcMar>
+          </w:tcPr>
+          <w:p>
+            <w:pPr>
+              <w:pBdr>
+                <w:bottom w:val="single" w:color="AAAAAA" w:sz="4" w:space="1"/>
+              </w:pBdr>
+              <w:spacing w:after="0" w:before="240"/>
+            </w:pPr>
+            <w:r>
+              <w:t xml:space="preserve"> </w:t>
+            </w:r>
+          </w:p>
+          <w:p>
+            <w:pPr>
+              <w:pBdr>
+                <w:bottom w:val="single" w:color="AAAAAA" w:sz="4" w:space="1"/>
+              </w:pBdr>
+              <w:spacing w:after="0" w:before="240"/>
+            </w:pPr>
+            <w:r>
+              <w:t xml:space="preserve"> </w:t>
+            </w:r>
+          </w:p>
+        </w:tc>
+      </w:tr>
+    </w:tbl>
+    <w:p>
+      <w:r>
+        <w:br w:type="page"/>
+      </w:r>
+    </w:p>
+    <w:tbl>
+      <w:tblPr>
+        <w:tblW w:type="dxa" w:w="9360"/>
+        <w:tblBorders>
+          <w:top w:val="single" w:color="auto" w:sz="4"/>
+          <w:left w:val="single" w:color="auto" w:sz="4"/>
+          <w:bottom w:val="single" w:color="auto" w:sz="4"/>
+          <w:right w:val="single" w:color="auto" w:sz="4"/>
+          <w:insideH w:val="single" w:color="auto" w:sz="4"/>
+          <w:insideV w:val="single" w:color="auto" w:sz="4"/>
+        </w:tblBorders>
+      </w:tblPr>
+      <w:tblGrid>
+        <w:gridCol w:w="2600"/>
+        <w:gridCol w:w="6760"/>
+      </w:tblGrid>
+      <w:tr>
+        <w:trPr>
+          <w:cantSplit w:val="off"/>
+        </w:trPr>
+        <w:tc>
+          <w:tcPr>
+            <w:tcW w:type="dxa" w:w="2600"/>
+            <w:tcBorders>
+              <w:top w:val="single" w:color="BBBBBB" w:sz="4"/>
+              <w:left w:val="single" w:color="BBBBBB" w:sz="4"/>
+              <w:bottom w:val="single" w:color="BBBBBB" w:sz="4"/>
+              <w:right w:val="single" w:color="BBBBBB" w:sz="4"/>
+            </w:tcBorders>
+            <w:shd w:fill="C2185B" w:color="auto" w:val="clear"/>
+            <w:tcMar>
+              <w:top w:type="dxa" w:w="100"/>
+              <w:left w:type="dxa" w:w="140"/>
+              <w:bottom w:type="dxa" w:w="100"/>
+              <w:right w:type="dxa" w:w="140"/>
+            </w:tcMar>
+          </w:tcPr>
+          <w:p>
+            <w:pPr>
+              <w:spacing w:after="120" w:line="300"/>
+            </w:pPr>
+            <w:r>
+              <w:rPr>
+                <w:b/>
+                <w:bCs/>
+                <w:color w:val="FFFFFF"/>
+              </w:rPr>
+              <w:t xml:space="preserve">Entrada</w:t>
+            </w:r>
+          </w:p>
+        </w:tc>
+        <w:tc>
+          <w:tcPr>
+            <w:tcW w:type="dxa" w:w="6760"/>
+            <w:tcBorders>
+              <w:top w:val="single" w:color="BBBBBB" w:sz="4"/>
+              <w:left w:val="single" w:color="BBBBBB" w:sz="4"/>
+              <w:bottom w:val="single" w:color="BBBBBB" w:sz="4"/>
+              <w:right w:val="single" w:color="BBBBBB" w:sz="4"/>
+            </w:tcBorders>
+            <w:shd w:fill="C2185B" w:color="auto" w:val="clear"/>
+            <w:tcMar>
+              <w:top w:type="dxa" w:w="100"/>
+              <w:left w:type="dxa" w:w="140"/>
+              <w:bottom w:type="dxa" w:w="100"/>
+              <w:right w:type="dxa" w:w="140"/>
+            </w:tcMar>
+          </w:tcPr>
+          <w:p>
+            <w:pPr>
+              <w:spacing w:after="120" w:line="300"/>
+            </w:pPr>
+            <w:r>
+              <w:rPr>
+                <w:rFonts w:ascii="Arial" w:cs="Arial" w:eastAsia="Arial" w:hAnsi="Arial"/>
+                <w:color w:val="FFFFFF"/>
+                <w:sz w:val="22"/>
+                <w:szCs w:val="22"/>
+              </w:rPr>
+              <w:t xml:space="preserve">14</w:t>
             </w:r>
           </w:p>
         </w:tc>

</xml_diff>

<commit_message>
ciberescudo: documentación y bitácora con Convivencia en la barra de abajo
Co-Authored-By: Claude Opus 5.5 <noreply@anthropic.com>
Claude-Session: https://claude.ai/code/session_017mGPQDWJF6quXgxpQqh3gs
</commit_message>
<xml_diff>
--- a/ciberescudo/entregables/BITACORA_IA.docx
+++ b/ciberescudo/entregables/BITACORA_IA.docx
@@ -10156,6 +10156,625 @@
                 <w:szCs w:val="22"/>
               </w:rPr>
               <w:t xml:space="preserve">14</w:t>
+            </w:r>
+          </w:p>
+        </w:tc>
+      </w:tr>
+      <w:tr>
+        <w:trPr>
+          <w:cantSplit w:val="off"/>
+        </w:trPr>
+        <w:tc>
+          <w:tcPr>
+            <w:tcW w:type="dxa" w:w="2600"/>
+            <w:tcBorders>
+              <w:top w:val="single" w:color="BBBBBB" w:sz="4"/>
+              <w:left w:val="single" w:color="BBBBBB" w:sz="4"/>
+              <w:bottom w:val="single" w:color="BBBBBB" w:sz="4"/>
+              <w:right w:val="single" w:color="BBBBBB" w:sz="4"/>
+            </w:tcBorders>
+            <w:shd w:fill="F3EEFA" w:color="auto" w:val="clear"/>
+            <w:tcMar>
+              <w:top w:type="dxa" w:w="100"/>
+              <w:left w:type="dxa" w:w="140"/>
+              <w:bottom w:type="dxa" w:w="100"/>
+              <w:right w:type="dxa" w:w="140"/>
+            </w:tcMar>
+          </w:tcPr>
+          <w:p>
+            <w:pPr>
+              <w:spacing w:after="120" w:line="300"/>
+            </w:pPr>
+            <w:r>
+              <w:rPr>
+                <w:b/>
+                <w:bCs/>
+                <w:color w:val="222222"/>
+              </w:rPr>
+              <w:t xml:space="preserve">Fecha</w:t>
+            </w:r>
+          </w:p>
+        </w:tc>
+        <w:tc>
+          <w:tcPr>
+            <w:tcW w:type="dxa" w:w="6760"/>
+            <w:tcBorders>
+              <w:top w:val="single" w:color="BBBBBB" w:sz="4"/>
+              <w:left w:val="single" w:color="BBBBBB" w:sz="4"/>
+              <w:bottom w:val="single" w:color="BBBBBB" w:sz="4"/>
+              <w:right w:val="single" w:color="BBBBBB" w:sz="4"/>
+            </w:tcBorders>
+            <w:tcMar>
+              <w:top w:type="dxa" w:w="100"/>
+              <w:left w:type="dxa" w:w="140"/>
+              <w:bottom w:type="dxa" w:w="100"/>
+              <w:right w:type="dxa" w:w="140"/>
+            </w:tcMar>
+          </w:tcPr>
+          <w:p>
+            <w:pPr>
+              <w:spacing w:after="120" w:line="300"/>
+            </w:pPr>
+            <w:r>
+              <w:rPr>
+                <w:rFonts w:ascii="Arial" w:cs="Arial" w:eastAsia="Arial" w:hAnsi="Arial"/>
+                <w:color w:val="222222"/>
+                <w:sz w:val="22"/>
+                <w:szCs w:val="22"/>
+              </w:rPr>
+              <w:t xml:space="preserve">30 de octubre de 2026</w:t>
+            </w:r>
+          </w:p>
+        </w:tc>
+      </w:tr>
+      <w:tr>
+        <w:trPr>
+          <w:cantSplit w:val="off"/>
+        </w:trPr>
+        <w:tc>
+          <w:tcPr>
+            <w:tcW w:type="dxa" w:w="2600"/>
+            <w:tcBorders>
+              <w:top w:val="single" w:color="BBBBBB" w:sz="4"/>
+              <w:left w:val="single" w:color="BBBBBB" w:sz="4"/>
+              <w:bottom w:val="single" w:color="BBBBBB" w:sz="4"/>
+              <w:right w:val="single" w:color="BBBBBB" w:sz="4"/>
+            </w:tcBorders>
+            <w:shd w:fill="F3EEFA" w:color="auto" w:val="clear"/>
+            <w:tcMar>
+              <w:top w:type="dxa" w:w="100"/>
+              <w:left w:type="dxa" w:w="140"/>
+              <w:bottom w:type="dxa" w:w="100"/>
+              <w:right w:type="dxa" w:w="140"/>
+            </w:tcMar>
+          </w:tcPr>
+          <w:p>
+            <w:pPr>
+              <w:spacing w:after="120" w:line="300"/>
+            </w:pPr>
+            <w:r>
+              <w:rPr>
+                <w:b/>
+                <w:bCs/>
+                <w:color w:val="222222"/>
+              </w:rPr>
+              <w:t xml:space="preserve">Herramienta y modelo</w:t>
+            </w:r>
+          </w:p>
+        </w:tc>
+        <w:tc>
+          <w:tcPr>
+            <w:tcW w:type="dxa" w:w="6760"/>
+            <w:tcBorders>
+              <w:top w:val="single" w:color="BBBBBB" w:sz="4"/>
+              <w:left w:val="single" w:color="BBBBBB" w:sz="4"/>
+              <w:bottom w:val="single" w:color="BBBBBB" w:sz="4"/>
+              <w:right w:val="single" w:color="BBBBBB" w:sz="4"/>
+            </w:tcBorders>
+            <w:tcMar>
+              <w:top w:type="dxa" w:w="100"/>
+              <w:left w:type="dxa" w:w="140"/>
+              <w:bottom w:type="dxa" w:w="100"/>
+              <w:right w:type="dxa" w:w="140"/>
+            </w:tcMar>
+          </w:tcPr>
+          <w:p>
+            <w:pPr>
+              <w:spacing w:after="120" w:line="300"/>
+            </w:pPr>
+            <w:r>
+              <w:rPr>
+                <w:rFonts w:ascii="Arial" w:cs="Arial" w:eastAsia="Arial" w:hAnsi="Arial"/>
+                <w:color w:val="222222"/>
+                <w:sz w:val="22"/>
+                <w:szCs w:val="22"/>
+              </w:rPr>
+              <w:t xml:space="preserve">Claude (Anthropic) · modelo: Claude Opus 5.5 · plan: Claude Pro</w:t>
+            </w:r>
+          </w:p>
+        </w:tc>
+      </w:tr>
+      <w:tr>
+        <w:trPr>
+          <w:cantSplit w:val="off"/>
+        </w:trPr>
+        <w:tc>
+          <w:tcPr>
+            <w:tcW w:type="dxa" w:w="2600"/>
+            <w:tcBorders>
+              <w:top w:val="single" w:color="BBBBBB" w:sz="4"/>
+              <w:left w:val="single" w:color="BBBBBB" w:sz="4"/>
+              <w:bottom w:val="single" w:color="BBBBBB" w:sz="4"/>
+              <w:right w:val="single" w:color="BBBBBB" w:sz="4"/>
+            </w:tcBorders>
+            <w:shd w:fill="F3EEFA" w:color="auto" w:val="clear"/>
+            <w:tcMar>
+              <w:top w:type="dxa" w:w="100"/>
+              <w:left w:type="dxa" w:w="140"/>
+              <w:bottom w:type="dxa" w:w="100"/>
+              <w:right w:type="dxa" w:w="140"/>
+            </w:tcMar>
+          </w:tcPr>
+          <w:p>
+            <w:pPr>
+              <w:spacing w:after="120" w:line="300"/>
+            </w:pPr>
+            <w:r>
+              <w:rPr>
+                <w:b/>
+                <w:bCs/>
+                <w:color w:val="222222"/>
+              </w:rPr>
+              <w:t xml:space="preserve">Objetivo del prompt</w:t>
+            </w:r>
+          </w:p>
+        </w:tc>
+        <w:tc>
+          <w:tcPr>
+            <w:tcW w:type="dxa" w:w="6760"/>
+            <w:tcBorders>
+              <w:top w:val="single" w:color="BBBBBB" w:sz="4"/>
+              <w:left w:val="single" w:color="BBBBBB" w:sz="4"/>
+              <w:bottom w:val="single" w:color="BBBBBB" w:sz="4"/>
+              <w:right w:val="single" w:color="BBBBBB" w:sz="4"/>
+            </w:tcBorders>
+            <w:tcMar>
+              <w:top w:type="dxa" w:w="100"/>
+              <w:left w:type="dxa" w:w="140"/>
+              <w:bottom w:type="dxa" w:w="100"/>
+              <w:right w:type="dxa" w:w="140"/>
+            </w:tcMar>
+          </w:tcPr>
+          <w:p>
+            <w:pPr>
+              <w:spacing w:after="120" w:line="300"/>
+            </w:pPr>
+            <w:r>
+              <w:rPr>
+                <w:rFonts w:ascii="Arial" w:cs="Arial" w:eastAsia="Arial" w:hAnsi="Arial"/>
+                <w:color w:val="222222"/>
+                <w:sz w:val="22"/>
+                <w:szCs w:val="22"/>
+              </w:rPr>
+              <w:t xml:space="preserve">Pasar Convivencia a la barra de abajo para que «Más» no esté tan saturado.</w:t>
+            </w:r>
+          </w:p>
+        </w:tc>
+      </w:tr>
+      <w:tr>
+        <w:trPr>
+          <w:cantSplit w:val="off"/>
+        </w:trPr>
+        <w:tc>
+          <w:tcPr>
+            <w:tcW w:type="dxa" w:w="2600"/>
+            <w:tcBorders>
+              <w:top w:val="single" w:color="BBBBBB" w:sz="4"/>
+              <w:left w:val="single" w:color="BBBBBB" w:sz="4"/>
+              <w:bottom w:val="single" w:color="BBBBBB" w:sz="4"/>
+              <w:right w:val="single" w:color="BBBBBB" w:sz="4"/>
+            </w:tcBorders>
+            <w:shd w:fill="F3EEFA" w:color="auto" w:val="clear"/>
+            <w:tcMar>
+              <w:top w:type="dxa" w:w="100"/>
+              <w:left w:type="dxa" w:w="140"/>
+              <w:bottom w:type="dxa" w:w="100"/>
+              <w:right w:type="dxa" w:w="140"/>
+            </w:tcMar>
+          </w:tcPr>
+          <w:p>
+            <w:pPr>
+              <w:spacing w:after="120" w:line="300"/>
+            </w:pPr>
+            <w:r>
+              <w:rPr>
+                <w:b/>
+                <w:bCs/>
+                <w:color w:val="222222"/>
+              </w:rPr>
+              <w:t xml:space="preserve">Prompt enviado</w:t>
+            </w:r>
+          </w:p>
+        </w:tc>
+        <w:tc>
+          <w:tcPr>
+            <w:tcW w:type="dxa" w:w="6760"/>
+            <w:tcBorders>
+              <w:top w:val="single" w:color="BBBBBB" w:sz="4"/>
+              <w:left w:val="single" w:color="BBBBBB" w:sz="4"/>
+              <w:bottom w:val="single" w:color="BBBBBB" w:sz="4"/>
+              <w:right w:val="single" w:color="BBBBBB" w:sz="4"/>
+            </w:tcBorders>
+            <w:tcMar>
+              <w:top w:type="dxa" w:w="100"/>
+              <w:left w:type="dxa" w:w="140"/>
+              <w:bottom w:type="dxa" w:w="100"/>
+              <w:right w:type="dxa" w:w="140"/>
+            </w:tcMar>
+          </w:tcPr>
+          <w:p>
+            <w:pPr>
+              <w:spacing w:after="120" w:line="300"/>
+            </w:pPr>
+            <w:r>
+              <w:rPr>
+                <w:rFonts w:ascii="Courier New" w:cs="Courier New" w:eastAsia="Courier New" w:hAnsi="Courier New"/>
+                <w:color w:val="222222"/>
+                <w:sz w:val="18"/>
+                <w:szCs w:val="18"/>
+              </w:rPr>
+              <w:t xml:space="preserve">Haz que este menú nuevo sea una pestaña de las que están abajo para que el “mas” no esté tan saturado</w:t>
+            </w:r>
+          </w:p>
+        </w:tc>
+      </w:tr>
+      <w:tr>
+        <w:trPr>
+          <w:cantSplit w:val="off"/>
+        </w:trPr>
+        <w:tc>
+          <w:tcPr>
+            <w:tcW w:type="dxa" w:w="2600"/>
+            <w:tcBorders>
+              <w:top w:val="single" w:color="BBBBBB" w:sz="4"/>
+              <w:left w:val="single" w:color="BBBBBB" w:sz="4"/>
+              <w:bottom w:val="single" w:color="BBBBBB" w:sz="4"/>
+              <w:right w:val="single" w:color="BBBBBB" w:sz="4"/>
+            </w:tcBorders>
+            <w:shd w:fill="F3EEFA" w:color="auto" w:val="clear"/>
+            <w:tcMar>
+              <w:top w:type="dxa" w:w="100"/>
+              <w:left w:type="dxa" w:w="140"/>
+              <w:bottom w:type="dxa" w:w="100"/>
+              <w:right w:type="dxa" w:w="140"/>
+            </w:tcMar>
+          </w:tcPr>
+          <w:p>
+            <w:pPr>
+              <w:spacing w:after="120" w:line="300"/>
+            </w:pPr>
+            <w:r>
+              <w:rPr>
+                <w:b/>
+                <w:bCs/>
+                <w:color w:val="222222"/>
+              </w:rPr>
+              <w:t xml:space="preserve">Respuesta / código generado (resumen)</w:t>
+            </w:r>
+          </w:p>
+        </w:tc>
+        <w:tc>
+          <w:tcPr>
+            <w:tcW w:type="dxa" w:w="6760"/>
+            <w:tcBorders>
+              <w:top w:val="single" w:color="BBBBBB" w:sz="4"/>
+              <w:left w:val="single" w:color="BBBBBB" w:sz="4"/>
+              <w:bottom w:val="single" w:color="BBBBBB" w:sz="4"/>
+              <w:right w:val="single" w:color="BBBBBB" w:sz="4"/>
+            </w:tcBorders>
+            <w:tcMar>
+              <w:top w:type="dxa" w:w="100"/>
+              <w:left w:type="dxa" w:w="140"/>
+              <w:bottom w:type="dxa" w:w="100"/>
+              <w:right w:type="dxa" w:w="140"/>
+            </w:tcMar>
+          </w:tcPr>
+          <w:p>
+            <w:pPr>
+              <w:spacing w:after="120" w:line="300"/>
+            </w:pPr>
+            <w:r>
+              <w:rPr>
+                <w:rFonts w:ascii="Arial" w:cs="Arial" w:eastAsia="Arial" w:hAnsi="Arial"/>
+                <w:color w:val="222222"/>
+                <w:sz w:val="22"/>
+                <w:szCs w:val="22"/>
+              </w:rPr>
+              <w:t xml:space="preserve">Agregó Convivencia como sexto botón de la barra (con la etiqueta corta «Convive», porque la palabra completa no cabía) y la quitó de «Más». Comprobó que las 6 etiquetas caben y que los botones miden más de 48 px en celulares de 360 y 390 px, acostado, en tablet y en computadora.</w:t>
+            </w:r>
+          </w:p>
+        </w:tc>
+      </w:tr>
+      <w:tr>
+        <w:trPr>
+          <w:cantSplit w:val="off"/>
+        </w:trPr>
+        <w:tc>
+          <w:tcPr>
+            <w:tcW w:type="dxa" w:w="2600"/>
+            <w:tcBorders>
+              <w:top w:val="single" w:color="BBBBBB" w:sz="4"/>
+              <w:left w:val="single" w:color="BBBBBB" w:sz="4"/>
+              <w:bottom w:val="single" w:color="BBBBBB" w:sz="4"/>
+              <w:right w:val="single" w:color="BBBBBB" w:sz="4"/>
+            </w:tcBorders>
+            <w:shd w:fill="F3EEFA" w:color="auto" w:val="clear"/>
+            <w:tcMar>
+              <w:top w:type="dxa" w:w="100"/>
+              <w:left w:type="dxa" w:w="140"/>
+              <w:bottom w:type="dxa" w:w="100"/>
+              <w:right w:type="dxa" w:w="140"/>
+            </w:tcMar>
+          </w:tcPr>
+          <w:p>
+            <w:pPr>
+              <w:spacing w:after="120" w:line="300"/>
+            </w:pPr>
+            <w:r>
+              <w:rPr>
+                <w:b/>
+                <w:bCs/>
+                <w:color w:val="222222"/>
+              </w:rPr>
+              <w:t xml:space="preserve">Ajustes manuales del equipo</w:t>
+            </w:r>
+          </w:p>
+        </w:tc>
+        <w:tc>
+          <w:tcPr>
+            <w:tcW w:type="dxa" w:w="6760"/>
+            <w:tcBorders>
+              <w:top w:val="single" w:color="BBBBBB" w:sz="4"/>
+              <w:left w:val="single" w:color="BBBBBB" w:sz="4"/>
+              <w:bottom w:val="single" w:color="BBBBBB" w:sz="4"/>
+              <w:right w:val="single" w:color="BBBBBB" w:sz="4"/>
+            </w:tcBorders>
+            <w:tcMar>
+              <w:top w:type="dxa" w:w="100"/>
+              <w:left w:type="dxa" w:w="140"/>
+              <w:bottom w:type="dxa" w:w="100"/>
+              <w:right w:type="dxa" w:w="140"/>
+            </w:tcMar>
+          </w:tcPr>
+          <w:p>
+            <w:pPr>
+              <w:pBdr>
+                <w:bottom w:val="single" w:color="AAAAAA" w:sz="4" w:space="1"/>
+              </w:pBdr>
+              <w:spacing w:after="0" w:before="240"/>
+            </w:pPr>
+            <w:r>
+              <w:t xml:space="preserve"> </w:t>
+            </w:r>
+          </w:p>
+          <w:p>
+            <w:pPr>
+              <w:pBdr>
+                <w:bottom w:val="single" w:color="AAAAAA" w:sz="4" w:space="1"/>
+              </w:pBdr>
+              <w:spacing w:after="0" w:before="240"/>
+            </w:pPr>
+            <w:r>
+              <w:t xml:space="preserve"> </w:t>
+            </w:r>
+          </w:p>
+          <w:p>
+            <w:pPr>
+              <w:pBdr>
+                <w:bottom w:val="single" w:color="AAAAAA" w:sz="4" w:space="1"/>
+              </w:pBdr>
+              <w:spacing w:after="0" w:before="240"/>
+            </w:pPr>
+            <w:r>
+              <w:t xml:space="preserve"> </w:t>
+            </w:r>
+          </w:p>
+          <w:p>
+            <w:pPr>
+              <w:pBdr>
+                <w:bottom w:val="single" w:color="AAAAAA" w:sz="4" w:space="1"/>
+              </w:pBdr>
+              <w:spacing w:after="0" w:before="240"/>
+            </w:pPr>
+            <w:r>
+              <w:t xml:space="preserve"> </w:t>
+            </w:r>
+          </w:p>
+          <w:p>
+            <w:pPr>
+              <w:pBdr>
+                <w:bottom w:val="single" w:color="AAAAAA" w:sz="4" w:space="1"/>
+              </w:pBdr>
+              <w:spacing w:after="0" w:before="240"/>
+            </w:pPr>
+            <w:r>
+              <w:t xml:space="preserve"> </w:t>
+            </w:r>
+          </w:p>
+          <w:p>
+            <w:pPr>
+              <w:pBdr>
+                <w:bottom w:val="single" w:color="AAAAAA" w:sz="4" w:space="1"/>
+              </w:pBdr>
+              <w:spacing w:after="0" w:before="240"/>
+            </w:pPr>
+            <w:r>
+              <w:t xml:space="preserve"> </w:t>
+            </w:r>
+          </w:p>
+        </w:tc>
+      </w:tr>
+      <w:tr>
+        <w:trPr>
+          <w:cantSplit w:val="off"/>
+        </w:trPr>
+        <w:tc>
+          <w:tcPr>
+            <w:tcW w:type="dxa" w:w="2600"/>
+            <w:tcBorders>
+              <w:top w:val="single" w:color="BBBBBB" w:sz="4"/>
+              <w:left w:val="single" w:color="BBBBBB" w:sz="4"/>
+              <w:bottom w:val="single" w:color="BBBBBB" w:sz="4"/>
+              <w:right w:val="single" w:color="BBBBBB" w:sz="4"/>
+            </w:tcBorders>
+            <w:shd w:fill="F3EEFA" w:color="auto" w:val="clear"/>
+            <w:tcMar>
+              <w:top w:type="dxa" w:w="100"/>
+              <w:left w:type="dxa" w:w="140"/>
+              <w:bottom w:type="dxa" w:w="100"/>
+              <w:right w:type="dxa" w:w="140"/>
+            </w:tcMar>
+          </w:tcPr>
+          <w:p>
+            <w:pPr>
+              <w:spacing w:after="120" w:line="300"/>
+            </w:pPr>
+            <w:r>
+              <w:rPr>
+                <w:b/>
+                <w:bCs/>
+                <w:color w:val="222222"/>
+              </w:rPr>
+              <w:t xml:space="preserve">¿Cómo verificamos que funcionaba?</w:t>
+            </w:r>
+          </w:p>
+        </w:tc>
+        <w:tc>
+          <w:tcPr>
+            <w:tcW w:type="dxa" w:w="6760"/>
+            <w:tcBorders>
+              <w:top w:val="single" w:color="BBBBBB" w:sz="4"/>
+              <w:left w:val="single" w:color="BBBBBB" w:sz="4"/>
+              <w:bottom w:val="single" w:color="BBBBBB" w:sz="4"/>
+              <w:right w:val="single" w:color="BBBBBB" w:sz="4"/>
+            </w:tcBorders>
+            <w:tcMar>
+              <w:top w:type="dxa" w:w="100"/>
+              <w:left w:type="dxa" w:w="140"/>
+              <w:bottom w:type="dxa" w:w="100"/>
+              <w:right w:type="dxa" w:w="140"/>
+            </w:tcMar>
+          </w:tcPr>
+          <w:p>
+            <w:pPr>
+              <w:pBdr>
+                <w:bottom w:val="single" w:color="AAAAAA" w:sz="4" w:space="1"/>
+              </w:pBdr>
+              <w:spacing w:after="0" w:before="240"/>
+            </w:pPr>
+            <w:r>
+              <w:t xml:space="preserve"> </w:t>
+            </w:r>
+          </w:p>
+          <w:p>
+            <w:pPr>
+              <w:pBdr>
+                <w:bottom w:val="single" w:color="AAAAAA" w:sz="4" w:space="1"/>
+              </w:pBdr>
+              <w:spacing w:after="0" w:before="240"/>
+            </w:pPr>
+            <w:r>
+              <w:t xml:space="preserve"> </w:t>
+            </w:r>
+          </w:p>
+        </w:tc>
+      </w:tr>
+    </w:tbl>
+    <w:p>
+      <w:r>
+        <w:br w:type="page"/>
+      </w:r>
+    </w:p>
+    <w:tbl>
+      <w:tblPr>
+        <w:tblW w:type="dxa" w:w="9360"/>
+        <w:tblBorders>
+          <w:top w:val="single" w:color="auto" w:sz="4"/>
+          <w:left w:val="single" w:color="auto" w:sz="4"/>
+          <w:bottom w:val="single" w:color="auto" w:sz="4"/>
+          <w:right w:val="single" w:color="auto" w:sz="4"/>
+          <w:insideH w:val="single" w:color="auto" w:sz="4"/>
+          <w:insideV w:val="single" w:color="auto" w:sz="4"/>
+        </w:tblBorders>
+      </w:tblPr>
+      <w:tblGrid>
+        <w:gridCol w:w="2600"/>
+        <w:gridCol w:w="6760"/>
+      </w:tblGrid>
+      <w:tr>
+        <w:trPr>
+          <w:cantSplit w:val="off"/>
+        </w:trPr>
+        <w:tc>
+          <w:tcPr>
+            <w:tcW w:type="dxa" w:w="2600"/>
+            <w:tcBorders>
+              <w:top w:val="single" w:color="BBBBBB" w:sz="4"/>
+              <w:left w:val="single" w:color="BBBBBB" w:sz="4"/>
+              <w:bottom w:val="single" w:color="BBBBBB" w:sz="4"/>
+              <w:right w:val="single" w:color="BBBBBB" w:sz="4"/>
+            </w:tcBorders>
+            <w:shd w:fill="C2185B" w:color="auto" w:val="clear"/>
+            <w:tcMar>
+              <w:top w:type="dxa" w:w="100"/>
+              <w:left w:type="dxa" w:w="140"/>
+              <w:bottom w:type="dxa" w:w="100"/>
+              <w:right w:type="dxa" w:w="140"/>
+            </w:tcMar>
+          </w:tcPr>
+          <w:p>
+            <w:pPr>
+              <w:spacing w:after="120" w:line="300"/>
+            </w:pPr>
+            <w:r>
+              <w:rPr>
+                <w:b/>
+                <w:bCs/>
+                <w:color w:val="FFFFFF"/>
+              </w:rPr>
+              <w:t xml:space="preserve">Entrada</w:t>
+            </w:r>
+          </w:p>
+        </w:tc>
+        <w:tc>
+          <w:tcPr>
+            <w:tcW w:type="dxa" w:w="6760"/>
+            <w:tcBorders>
+              <w:top w:val="single" w:color="BBBBBB" w:sz="4"/>
+              <w:left w:val="single" w:color="BBBBBB" w:sz="4"/>
+              <w:bottom w:val="single" w:color="BBBBBB" w:sz="4"/>
+              <w:right w:val="single" w:color="BBBBBB" w:sz="4"/>
+            </w:tcBorders>
+            <w:shd w:fill="C2185B" w:color="auto" w:val="clear"/>
+            <w:tcMar>
+              <w:top w:type="dxa" w:w="100"/>
+              <w:left w:type="dxa" w:w="140"/>
+              <w:bottom w:type="dxa" w:w="100"/>
+              <w:right w:type="dxa" w:w="140"/>
+            </w:tcMar>
+          </w:tcPr>
+          <w:p>
+            <w:pPr>
+              <w:spacing w:after="120" w:line="300"/>
+            </w:pPr>
+            <w:r>
+              <w:rPr>
+                <w:rFonts w:ascii="Arial" w:cs="Arial" w:eastAsia="Arial" w:hAnsi="Arial"/>
+                <w:color w:val="FFFFFF"/>
+                <w:sz w:val="22"/>
+                <w:szCs w:val="22"/>
+              </w:rPr>
+              <w:t xml:space="preserve">15</w:t>
             </w:r>
           </w:p>
         </w:tc>

</xml_diff>